<commit_message>
did some of part 1
</commit_message>
<xml_diff>
--- a/INFO2222-P1.docx
+++ b/INFO2222-P1.docx
@@ -362,6 +362,12 @@
                 <w:rFonts w:ascii="Times New Roman" w:hAnsi="Times New Roman" w:cs="Times New Roman"/>
               </w:rPr>
             </w:pPr>
+            <w:r>
+              <w:rPr>
+                <w:rFonts w:ascii="Times New Roman" w:hAnsi="Times New Roman" w:cs="Times New Roman"/>
+              </w:rPr>
+              <w:t xml:space="preserve">Hilton Naidu </w:t>
+            </w:r>
           </w:p>
         </w:tc>
       </w:tr>
@@ -839,27 +845,26 @@
           <w:rFonts w:ascii="Times New Roman" w:hAnsi="Times New Roman" w:cs="Times New Roman"/>
         </w:rPr>
       </w:pPr>
-    </w:p>
-    <w:p>
-      <w:pPr>
+      <w:r>
         <w:rPr>
           <w:rFonts w:ascii="Times New Roman" w:hAnsi="Times New Roman" w:cs="Times New Roman"/>
         </w:rPr>
-      </w:pPr>
-    </w:p>
-    <w:p>
-      <w:pPr>
+        <w:t xml:space="preserve">Our Platform will implement user selectable task allocation, in a clear visual format, as well </w:t>
+      </w:r>
+      <w:proofErr w:type="spellStart"/>
+      <w:r>
         <w:rPr>
           <w:rFonts w:ascii="Times New Roman" w:hAnsi="Times New Roman" w:cs="Times New Roman"/>
         </w:rPr>
-      </w:pPr>
-    </w:p>
-    <w:p>
-      <w:pPr>
+        <w:t>a</w:t>
+      </w:r>
+      <w:proofErr w:type="spellEnd"/>
+      <w:r>
         <w:rPr>
           <w:rFonts w:ascii="Times New Roman" w:hAnsi="Times New Roman" w:cs="Times New Roman"/>
         </w:rPr>
-      </w:pPr>
+        <w:t xml:space="preserve"> creating sub-teams relevant to individual tasks.</w:t>
+      </w:r>
     </w:p>
     <w:p>
       <w:pPr>
@@ -888,6 +893,20 @@
           <w:rFonts w:ascii="Times New Roman" w:hAnsi="Times New Roman" w:cs="Times New Roman"/>
         </w:rPr>
       </w:pPr>
+    </w:p>
+    <w:p>
+      <w:pPr>
+        <w:rPr>
+          <w:rFonts w:ascii="Times New Roman" w:hAnsi="Times New Roman" w:cs="Times New Roman"/>
+        </w:rPr>
+      </w:pPr>
+    </w:p>
+    <w:p>
+      <w:pPr>
+        <w:rPr>
+          <w:rFonts w:ascii="Times New Roman" w:hAnsi="Times New Roman" w:cs="Times New Roman"/>
+        </w:rPr>
+      </w:pPr>
       <w:r>
         <w:rPr>
           <w:rFonts w:ascii="Times New Roman" w:eastAsia="Times New Roman" w:hAnsi="Times New Roman" w:cs="Times New Roman"/>
@@ -929,15 +948,61 @@
           <w:rFonts w:ascii="Times New Roman" w:hAnsi="Times New Roman" w:cs="Times New Roman"/>
         </w:rPr>
       </w:pPr>
-    </w:p>
-    <w:p>
-      <w:pPr>
+      <w:r>
         <w:rPr>
           <w:rFonts w:ascii="Times New Roman" w:hAnsi="Times New Roman" w:cs="Times New Roman"/>
-          <w:b/>
-          <w:bCs/>
-        </w:rPr>
-      </w:pPr>
+        </w:rPr>
+        <w:t xml:space="preserve">This will allow our students to streamline their communications and only engage in discussions relevant to </w:t>
+      </w:r>
+      <w:proofErr w:type="gramStart"/>
+      <w:r>
+        <w:rPr>
+          <w:rFonts w:ascii="Times New Roman" w:hAnsi="Times New Roman" w:cs="Times New Roman"/>
+        </w:rPr>
+        <w:t>them, and</w:t>
+      </w:r>
+      <w:proofErr w:type="gramEnd"/>
+      <w:r>
+        <w:rPr>
+          <w:rFonts w:ascii="Times New Roman" w:hAnsi="Times New Roman" w:cs="Times New Roman"/>
+        </w:rPr>
+        <w:t xml:space="preserve"> improving fair workload distribution and task management. </w:t>
+      </w:r>
+    </w:p>
+    <w:p>
+      <w:pPr>
+        <w:rPr>
+          <w:rFonts w:ascii="Times New Roman" w:hAnsi="Times New Roman" w:cs="Times New Roman"/>
+          <w:b/>
+          <w:bCs/>
+        </w:rPr>
+      </w:pPr>
+    </w:p>
+    <w:p>
+      <w:pPr>
+        <w:rPr>
+          <w:rFonts w:ascii="Times New Roman" w:hAnsi="Times New Roman" w:cs="Times New Roman"/>
+          <w:b/>
+          <w:bCs/>
+        </w:rPr>
+      </w:pPr>
+    </w:p>
+    <w:p>
+      <w:pPr>
+        <w:rPr>
+          <w:rFonts w:ascii="Times New Roman" w:hAnsi="Times New Roman" w:cs="Times New Roman"/>
+          <w:b/>
+          <w:bCs/>
+        </w:rPr>
+      </w:pPr>
+      <w:r>
+        <w:rPr>
+          <w:rFonts w:ascii="Times New Roman" w:hAnsi="Times New Roman" w:cs="Times New Roman"/>
+          <w:b/>
+          <w:bCs/>
+        </w:rPr>
+        <w:t>Let me know what you guys think???</w:t>
+      </w:r>
       <w:r>
         <w:rPr>
           <w:rFonts w:ascii="Times New Roman" w:hAnsi="Times New Roman" w:cs="Times New Roman"/>
@@ -1046,29 +1111,7 @@
           <w:lang w:eastAsia="en-GB"/>
           <w14:ligatures w14:val="none"/>
         </w:rPr>
-        <w:t>(</w:t>
-      </w:r>
-      <w:r>
-        <w:rPr>
-          <w:rFonts w:ascii="Times New Roman" w:eastAsia="Times New Roman" w:hAnsi="Times New Roman" w:cs="Times New Roman"/>
-          <w:b/>
-          <w:bCs/>
-          <w:kern w:val="0"/>
-          <w:lang w:eastAsia="en-GB"/>
-          <w14:ligatures w14:val="none"/>
-        </w:rPr>
-        <w:t>Please use the table below to answer</w:t>
-      </w:r>
-      <w:r>
-        <w:rPr>
-          <w:rFonts w:ascii="Times New Roman" w:eastAsia="Times New Roman" w:hAnsi="Times New Roman" w:cs="Times New Roman"/>
-          <w:b/>
-          <w:bCs/>
-          <w:kern w:val="0"/>
-          <w:lang w:eastAsia="en-GB"/>
-          <w14:ligatures w14:val="none"/>
-        </w:rPr>
-        <w:t>)</w:t>
+        <w:t>(Please use the table below to answer)</w:t>
       </w:r>
     </w:p>
     <w:p>
@@ -1942,98 +1985,54 @@
           <w:lang w:eastAsia="en-GB"/>
           <w14:ligatures w14:val="none"/>
         </w:rPr>
-        <w:t>Task 2-</w:t>
-      </w:r>
-      <w:r>
-        <w:rPr>
-          <w:rFonts w:ascii="Times New Roman" w:eastAsia="Times New Roman" w:hAnsi="Times New Roman" w:cs="Times New Roman"/>
-          <w:b/>
-          <w:bCs/>
-          <w:kern w:val="0"/>
-          <w:lang w:eastAsia="en-GB"/>
-          <w14:ligatures w14:val="none"/>
-        </w:rPr>
-        <w:t>c</w:t>
-      </w:r>
-      <w:r>
-        <w:rPr>
-          <w:rFonts w:ascii="Times New Roman" w:eastAsia="Times New Roman" w:hAnsi="Times New Roman" w:cs="Times New Roman"/>
-          <w:b/>
-          <w:bCs/>
-          <w:kern w:val="0"/>
-          <w:lang w:eastAsia="en-GB"/>
-          <w14:ligatures w14:val="none"/>
-        </w:rPr>
-        <w:t xml:space="preserve"> </w:t>
-      </w:r>
-    </w:p>
-    <w:p>
-      <w:pPr>
-        <w:rPr>
-          <w:rFonts w:ascii="Times New Roman" w:eastAsia="Times New Roman" w:hAnsi="Times New Roman" w:cs="Times New Roman"/>
-          <w:b/>
-          <w:bCs/>
-          <w:kern w:val="0"/>
-          <w:lang w:eastAsia="en-GB"/>
-          <w14:ligatures w14:val="none"/>
-        </w:rPr>
-      </w:pPr>
-    </w:p>
-    <w:p>
-      <w:pPr>
-        <w:rPr>
-          <w:rFonts w:ascii="Times New Roman" w:eastAsia="Times New Roman" w:hAnsi="Times New Roman" w:cs="Times New Roman"/>
-          <w:b/>
-          <w:bCs/>
-          <w:kern w:val="0"/>
-          <w:lang w:eastAsia="en-GB"/>
-          <w14:ligatures w14:val="none"/>
-        </w:rPr>
-      </w:pPr>
-    </w:p>
-    <w:p>
-      <w:pPr>
-        <w:rPr>
-          <w:rFonts w:ascii="Times New Roman" w:eastAsia="Times New Roman" w:hAnsi="Times New Roman" w:cs="Times New Roman"/>
-          <w:b/>
-          <w:bCs/>
-          <w:kern w:val="0"/>
-          <w:lang w:eastAsia="en-GB"/>
-          <w14:ligatures w14:val="none"/>
-        </w:rPr>
-      </w:pPr>
-      <w:r>
-        <w:rPr>
-          <w:rFonts w:ascii="Times New Roman" w:eastAsia="Times New Roman" w:hAnsi="Times New Roman" w:cs="Times New Roman"/>
-          <w:b/>
-          <w:bCs/>
-          <w:kern w:val="0"/>
-          <w:lang w:eastAsia="en-GB"/>
-          <w14:ligatures w14:val="none"/>
-        </w:rPr>
-        <w:t>Task 2-</w:t>
-      </w:r>
-      <w:r>
-        <w:rPr>
-          <w:rFonts w:ascii="Times New Roman" w:eastAsia="Times New Roman" w:hAnsi="Times New Roman" w:cs="Times New Roman"/>
-          <w:b/>
-          <w:bCs/>
-          <w:kern w:val="0"/>
-          <w:lang w:eastAsia="en-GB"/>
-          <w14:ligatures w14:val="none"/>
-        </w:rPr>
-        <w:t>d</w:t>
-      </w:r>
-      <w:r>
-        <w:rPr>
-          <w:rFonts w:ascii="Times New Roman" w:eastAsia="Times New Roman" w:hAnsi="Times New Roman" w:cs="Times New Roman"/>
-          <w:b/>
-          <w:bCs/>
-          <w:kern w:val="0"/>
-          <w:lang w:eastAsia="en-GB"/>
-          <w14:ligatures w14:val="none"/>
-        </w:rPr>
-        <w:t xml:space="preserve"> </w:t>
+        <w:t xml:space="preserve">Task 2-c </w:t>
+      </w:r>
+    </w:p>
+    <w:p>
+      <w:pPr>
+        <w:rPr>
+          <w:rFonts w:ascii="Times New Roman" w:eastAsia="Times New Roman" w:hAnsi="Times New Roman" w:cs="Times New Roman"/>
+          <w:b/>
+          <w:bCs/>
+          <w:kern w:val="0"/>
+          <w:lang w:eastAsia="en-GB"/>
+          <w14:ligatures w14:val="none"/>
+        </w:rPr>
+      </w:pPr>
+    </w:p>
+    <w:p>
+      <w:pPr>
+        <w:rPr>
+          <w:rFonts w:ascii="Times New Roman" w:eastAsia="Times New Roman" w:hAnsi="Times New Roman" w:cs="Times New Roman"/>
+          <w:b/>
+          <w:bCs/>
+          <w:kern w:val="0"/>
+          <w:lang w:eastAsia="en-GB"/>
+          <w14:ligatures w14:val="none"/>
+        </w:rPr>
+      </w:pPr>
+    </w:p>
+    <w:p>
+      <w:pPr>
+        <w:rPr>
+          <w:rFonts w:ascii="Times New Roman" w:eastAsia="Times New Roman" w:hAnsi="Times New Roman" w:cs="Times New Roman"/>
+          <w:b/>
+          <w:bCs/>
+          <w:kern w:val="0"/>
+          <w:lang w:eastAsia="en-GB"/>
+          <w14:ligatures w14:val="none"/>
+        </w:rPr>
+      </w:pPr>
+      <w:r>
+        <w:rPr>
+          <w:rFonts w:ascii="Times New Roman" w:eastAsia="Times New Roman" w:hAnsi="Times New Roman" w:cs="Times New Roman"/>
+          <w:b/>
+          <w:bCs/>
+          <w:kern w:val="0"/>
+          <w:lang w:eastAsia="en-GB"/>
+          <w14:ligatures w14:val="none"/>
+        </w:rPr>
+        <w:t xml:space="preserve">Task 2-d </w:t>
       </w:r>
       <w:r>
         <w:rPr>
@@ -3147,7 +3146,7 @@
                 <w:lang w:eastAsia="en-GB"/>
                 <w14:ligatures w14:val="none"/>
               </w:rPr>
-              <w:t>1</w:t>
+              <w:t>2</w:t>
             </w:r>
           </w:p>
         </w:tc>
@@ -3170,10 +3169,10 @@
               <w:rPr>
                 <w:rFonts w:ascii="Times New Roman" w:eastAsia="Times New Roman" w:hAnsi="Times New Roman" w:cs="Times New Roman"/>
                 <w:kern w:val="0"/>
-                <w:lang w:val="en-GB" w:eastAsia="en-GB"/>
-                <w14:ligatures w14:val="none"/>
-              </w:rPr>
-              <w:t>Jane Doh</w:t>
+                <w:lang w:eastAsia="en-GB"/>
+                <w14:ligatures w14:val="none"/>
+              </w:rPr>
+              <w:t xml:space="preserve">Hilton Naidu </w:t>
             </w:r>
           </w:p>
         </w:tc>
@@ -3192,6 +3191,15 @@
                 <w14:ligatures w14:val="none"/>
               </w:rPr>
             </w:pPr>
+            <w:r>
+              <w:rPr>
+                <w:rFonts w:ascii="Times New Roman" w:eastAsia="Times New Roman" w:hAnsi="Times New Roman" w:cs="Times New Roman"/>
+                <w:kern w:val="0"/>
+                <w:lang w:eastAsia="en-GB"/>
+                <w14:ligatures w14:val="none"/>
+              </w:rPr>
+              <w:t xml:space="preserve">I created the GitHub repo, uploaded templet files and created issues matching each part of the assessment. </w:t>
+            </w:r>
           </w:p>
         </w:tc>
       </w:tr>
@@ -4666,6 +4674,7 @@
   <w:style w:type="character" w:default="1" w:styleId="DefaultParagraphFont">
     <w:name w:val="Default Paragraph Font"/>
     <w:uiPriority w:val="1"/>
+    <w:semiHidden/>
     <w:unhideWhenUsed/>
   </w:style>
   <w:style w:type="table" w:default="1" w:styleId="TableNormal">

</xml_diff>

<commit_message>
added some content for 2a
</commit_message>
<xml_diff>
--- a/INFO2222-P1.docx
+++ b/INFO2222-P1.docx
@@ -409,6 +409,12 @@
                 <w:rFonts w:ascii="Times New Roman" w:hAnsi="Times New Roman" w:cs="Times New Roman"/>
               </w:rPr>
             </w:pPr>
+            <w:r>
+              <w:rPr>
+                <w:rFonts w:ascii="Times New Roman" w:hAnsi="Times New Roman" w:cs="Times New Roman"/>
+              </w:rPr>
+              <w:t>550770402</w:t>
+            </w:r>
           </w:p>
         </w:tc>
       </w:tr>
@@ -1225,6 +1231,15 @@
                 <w14:ligatures w14:val="none"/>
               </w:rPr>
             </w:pPr>
+            <w:r>
+              <w:rPr>
+                <w:rFonts w:ascii="Times New Roman" w:eastAsia="Times New Roman" w:hAnsi="Times New Roman" w:cs="Times New Roman"/>
+                <w:kern w:val="0"/>
+                <w:lang w:eastAsia="en-GB"/>
+                <w14:ligatures w14:val="none"/>
+              </w:rPr>
+              <w:t>ChatGPT</w:t>
+            </w:r>
           </w:p>
         </w:tc>
         <w:tc>
@@ -1240,6 +1255,15 @@
                 <w14:ligatures w14:val="none"/>
               </w:rPr>
             </w:pPr>
+            <w:r>
+              <w:rPr>
+                <w:rFonts w:ascii="Times New Roman" w:eastAsia="Times New Roman" w:hAnsi="Times New Roman" w:cs="Times New Roman"/>
+                <w:kern w:val="0"/>
+                <w:lang w:eastAsia="en-GB"/>
+                <w14:ligatures w14:val="none"/>
+              </w:rPr>
+              <w:t>5</w:t>
+            </w:r>
           </w:p>
         </w:tc>
         <w:tc>
@@ -1255,6 +1279,15 @@
                 <w14:ligatures w14:val="none"/>
               </w:rPr>
             </w:pPr>
+            <w:r>
+              <w:rPr>
+                <w:rFonts w:ascii="Times New Roman" w:eastAsia="Times New Roman" w:hAnsi="Times New Roman" w:cs="Times New Roman"/>
+                <w:kern w:val="0"/>
+                <w:lang w:eastAsia="en-GB"/>
+                <w14:ligatures w14:val="none"/>
+              </w:rPr>
+              <w:t>https://chatgpt.com</w:t>
+            </w:r>
           </w:p>
         </w:tc>
       </w:tr>
@@ -1272,6 +1305,15 @@
                 <w14:ligatures w14:val="none"/>
               </w:rPr>
             </w:pPr>
+            <w:r>
+              <w:rPr>
+                <w:rFonts w:ascii="Times New Roman" w:eastAsia="Times New Roman" w:hAnsi="Times New Roman" w:cs="Times New Roman"/>
+                <w:kern w:val="0"/>
+                <w:lang w:eastAsia="en-GB"/>
+                <w14:ligatures w14:val="none"/>
+              </w:rPr>
+              <w:t xml:space="preserve">Claude </w:t>
+            </w:r>
           </w:p>
         </w:tc>
         <w:tc>
@@ -1319,6 +1361,15 @@
                 <w14:ligatures w14:val="none"/>
               </w:rPr>
             </w:pPr>
+            <w:r>
+              <w:rPr>
+                <w:rFonts w:ascii="Times New Roman" w:eastAsia="Times New Roman" w:hAnsi="Times New Roman" w:cs="Times New Roman"/>
+                <w:kern w:val="0"/>
+                <w:lang w:eastAsia="en-GB"/>
+                <w14:ligatures w14:val="none"/>
+              </w:rPr>
+              <w:t>Gemini</w:t>
+            </w:r>
           </w:p>
         </w:tc>
         <w:tc>
@@ -1366,6 +1417,15 @@
                 <w14:ligatures w14:val="none"/>
               </w:rPr>
             </w:pPr>
+            <w:r>
+              <w:rPr>
+                <w:rFonts w:ascii="Times New Roman" w:eastAsia="Times New Roman" w:hAnsi="Times New Roman" w:cs="Times New Roman"/>
+                <w:kern w:val="0"/>
+                <w:lang w:eastAsia="en-GB"/>
+                <w14:ligatures w14:val="none"/>
+              </w:rPr>
+              <w:t xml:space="preserve">Copilot </w:t>
+            </w:r>
           </w:p>
         </w:tc>
         <w:tc>
@@ -1413,6 +1473,15 @@
                 <w14:ligatures w14:val="none"/>
               </w:rPr>
             </w:pPr>
+            <w:r>
+              <w:rPr>
+                <w:rFonts w:ascii="Times New Roman" w:eastAsia="Times New Roman" w:hAnsi="Times New Roman" w:cs="Times New Roman"/>
+                <w:kern w:val="0"/>
+                <w:lang w:eastAsia="en-GB"/>
+                <w14:ligatures w14:val="none"/>
+              </w:rPr>
+              <w:t>Base44</w:t>
+            </w:r>
           </w:p>
         </w:tc>
         <w:tc>
@@ -1460,6 +1529,15 @@
                 <w14:ligatures w14:val="none"/>
               </w:rPr>
             </w:pPr>
+            <w:r>
+              <w:rPr>
+                <w:rFonts w:ascii="Times New Roman" w:eastAsia="Times New Roman" w:hAnsi="Times New Roman" w:cs="Times New Roman"/>
+                <w:kern w:val="0"/>
+                <w:lang w:eastAsia="en-GB"/>
+                <w14:ligatures w14:val="none"/>
+              </w:rPr>
+              <w:t>V0</w:t>
+            </w:r>
           </w:p>
         </w:tc>
         <w:tc>
@@ -3198,7 +3276,36 @@
                 <w:lang w:eastAsia="en-GB"/>
                 <w14:ligatures w14:val="none"/>
               </w:rPr>
+              <w:t xml:space="preserve">1. </w:t>
+            </w:r>
+            <w:r>
+              <w:rPr>
+                <w:rFonts w:ascii="Times New Roman" w:eastAsia="Times New Roman" w:hAnsi="Times New Roman" w:cs="Times New Roman"/>
+                <w:kern w:val="0"/>
+                <w:lang w:eastAsia="en-GB"/>
+                <w14:ligatures w14:val="none"/>
+              </w:rPr>
               <w:t xml:space="preserve">I created the GitHub repo, uploaded templet files and created issues matching each part of the assessment. </w:t>
+            </w:r>
+            <w:r>
+              <w:rPr>
+                <w:rFonts w:ascii="Times New Roman" w:eastAsia="Times New Roman" w:hAnsi="Times New Roman" w:cs="Times New Roman"/>
+                <w:kern w:val="0"/>
+                <w:lang w:eastAsia="en-GB"/>
+                <w14:ligatures w14:val="none"/>
+              </w:rPr>
+              <w:br/>
+              <w:t xml:space="preserve">2. Filled out section 1b and 1c, awaiting feedback from the group. </w:t>
+            </w:r>
+            <w:r>
+              <w:rPr>
+                <w:rFonts w:ascii="Times New Roman" w:eastAsia="Times New Roman" w:hAnsi="Times New Roman" w:cs="Times New Roman"/>
+                <w:kern w:val="0"/>
+                <w:lang w:eastAsia="en-GB"/>
+                <w14:ligatures w14:val="none"/>
+              </w:rPr>
+              <w:br/>
+              <w:t xml:space="preserve">3. </w:t>
             </w:r>
           </w:p>
         </w:tc>

</xml_diff>